<commit_message>
fix: render customer city in DOCX + force Hebrew PDF header dates
- Inject {customerCity} into empty fldCity bookmarks at merge time so the
  customer's city prints on templates that only carried the bookmark — the
  city was silently dropped on ~60 quote templates.
- Build the Gregorian Hebrew date manually instead of via Intl/he-IL, which
  returns English (or throws) on servers whose Node ICU lacks the he-IL
  locale. That failure aborted DATE-field freezing and left raw "dd/y" field
  codes in the converted PDF header. hebcal failure now falls back gracefully.

Also bundles pending feat/quote-template-two-pair-tables working-tree changes.

Co-Authored-By: Claude Opus 4.8 <noreply@anthropic.com>
</commit_message>
<xml_diff>
--- a/apps/api/templates/_mapping-check.docx
+++ b/apps/api/templates/_mapping-check.docx
@@ -2781,6 +2781,7 @@
         <w:tblpPr w:leftFromText="180" w:rightFromText="180" w:vertAnchor="text" w:horzAnchor="page" w:tblpX="1453" w:tblpY="199"/>
         <w:bidiVisual/>
         <w:tblW w:w="0" w:type="auto"/>
+        <w:jc w:val="right"/>
         <w:tblBorders>
           <w:top w:val="single" w:sz="4" w:space="0" w:color="auto"/>
           <w:left w:val="single" w:sz="4" w:space="0" w:color="auto"/>
@@ -2792,13 +2793,13 @@
         <w:tblLook w:val="04A0" w:firstRow="1" w:lastRow="0" w:firstColumn="1" w:lastColumn="0" w:noHBand="0" w:noVBand="1"/>
       </w:tblPr>
       <w:tblGrid>
-        <w:gridCol w:w="1764"/>
+        <w:gridCol w:w="8065"/>
         <w:gridCol w:w="1764"/>
       </w:tblGrid>
       <w:tr>
         <w:tc>
           <w:tcPr>
-            <w:tcW w:w="1764" w:type="dxa"/>
+            <w:tcW w:w="8065" w:type="dxa"/>
             <w:shd w:val="clear" w:color="auto" w:fill="auto"/>
           </w:tcPr>
           <w:p>
@@ -2866,7 +2867,7 @@
       <w:tr>
         <w:tc>
           <w:tcPr>
-            <w:tcW w:w="1764" w:type="dxa"/>
+            <w:tcW w:w="8065" w:type="dxa"/>
             <w:shd w:val="clear" w:color="auto" w:fill="auto"/>
           </w:tcPr>
           <w:p>
@@ -2923,7 +2924,7 @@
       <w:tr>
         <w:tc>
           <w:tcPr>
-            <w:tcW w:w="1764" w:type="dxa"/>
+            <w:tcW w:w="8065" w:type="dxa"/>
             <w:shd w:val="clear" w:color="auto" w:fill="auto"/>
           </w:tcPr>
           <w:p>
@@ -3002,7 +3003,7 @@
       <w:tr>
         <w:tc>
           <w:tcPr>
-            <w:tcW w:w="1764" w:type="dxa"/>
+            <w:tcW w:w="8065" w:type="dxa"/>
             <w:shd w:val="clear" w:color="auto" w:fill="auto"/>
           </w:tcPr>
           <w:p>

</xml_diff>

<commit_message>
feat: report email + AI meeting titles, Outlook attachments, fax-line removal, PDF button placement
- send-report: "נסח לי מייל" re-references the quote and states the work is done
- coordination: AI-drafted meeting titles (GPT) including location, slightly longer; optional file attachments on the Outlook event
- quotes: strip legacy fax line from all merged docx (runtime + cleaned 78 templates)
- pdf buttons: place directly under content (image-aware), avoid a trailing blank page
- api base: self-heal so profile button never points at the frontend domain (404 fix)
- customers: POTENTIAL classification + migration

Co-Authored-By: Claude Opus 4.8 (1M context) <noreply@anthropic.com>
</commit_message>
<xml_diff>
--- a/apps/api/templates/_mapping-check.docx
+++ b/apps/api/templates/_mapping-check.docx
@@ -3397,51 +3397,6 @@
     <w:p>
       <w:pPr>
         <w:rPr>
-          <w:rFonts w:cs="David" w:hint="cs"/>
-          <w:b/>
-          <w:bCs/>
-          <w:sz w:val="28"/>
-          <w:szCs w:val="28"/>
-          <w:u w:val="single"/>
-          <w:rtl/>
-        </w:rPr>
-      </w:pPr>
-      <w:r>
-        <w:rPr>
-          <w:rFonts w:cs="David" w:hint="cs"/>
-          <w:b/>
-          <w:bCs/>
-          <w:sz w:val="28"/>
-          <w:szCs w:val="28"/>
-          <w:u w:val="single"/>
-          <w:rtl/>
-        </w:rPr>
-        <w:t>אישור ההצעה</w:t>
-      </w:r>
-      <w:r>
-        <w:rPr>
-          <w:rFonts w:cs="David" w:hint="cs"/>
-          <w:b/>
-          <w:bCs/>
-          <w:sz w:val="28"/>
-          <w:szCs w:val="28"/>
-          <w:rtl/>
-        </w:rPr>
-        <w:t xml:space="preserve">: </w:t>
-      </w:r>
-      <w:r>
-        <w:rPr>
-          <w:rFonts w:cs="David" w:hint="cs"/>
-          <w:sz w:val="28"/>
-          <w:szCs w:val="28"/>
-          <w:rtl/>
-        </w:rPr>
-        <w:t xml:space="preserve">נא לשלוח את ההצעה חתומה לפקס 09-7724446 ואנו נחזור לתאם הגעה בהקדם. </w:t>
-      </w:r>
-    </w:p>
-    <w:p>
-      <w:pPr>
-        <w:rPr>
           <w:rFonts w:cs="David"/>
           <w:b/>
           <w:bCs/>
@@ -3464,27 +3419,6 @@
           <w:rtl/>
         </w:rPr>
       </w:pPr>
-    </w:p>
-    <w:p>
-      <w:pPr>
-        <w:ind w:left="720"/>
-        <w:jc w:val="both"/>
-        <w:rPr>
-          <w:rFonts w:ascii="Arial" w:hAnsi="Arial" w:cs="Arial"/>
-          <w:sz w:val="28"/>
-          <w:szCs w:val="28"/>
-          <w:rtl/>
-        </w:rPr>
-      </w:pPr>
-      <w:r>
-        <w:rPr>
-          <w:rFonts w:cs="David" w:hint="cs"/>
-          <w:sz w:val="28"/>
-          <w:szCs w:val="28"/>
-          <w:rtl/>
-        </w:rPr>
-        <w:t>לתיאום הגעה, נא לחתום ולשלוח לפקס 09-7724446. תודה.</w:t>
-      </w:r>
     </w:p>
     <w:p>
       <w:pPr>

</xml_diff>